<commit_message>
docs: polish PDF and Word study guide layout
</commit_message>
<xml_diff>
--- a/documentation/lab01_variant15.docx
+++ b/documentation/lab01_variant15.docx
@@ -638,13 +638,9 @@
       </w:r>
     </w:p>
     <w:p>
-      <w:r>
-        <w:br w:type="page"/>
-      </w:r>
-    </w:p>
-    <w:p>
       <w:pPr>
         <w:pStyle w:val="Title"/>
+        <w:pageBreakBefore/>
       </w:pPr>
       <w:r>
         <w:t>Отчёт по ЛР 1. Анализ сложности</w:t>
@@ -1956,17 +1952,18 @@
         <w:pStyle w:val="ListBullet"/>
       </w:pPr>
       <w:r>
-        <w:br/>
+        <w:t xml:space="preserve"> </w:t>
       </w:r>
+      <w:hyperlink r:id="rId15">
+        <w:r>
+          <w:rPr>
+            <w:color w:val="245B84"/>
+          </w:rPr>
+          <w:t>measurements.csv</w:t>
+        </w:r>
+      </w:hyperlink>
       <w:r>
-        <w:rPr>
-          <w:b w:val="0"/>
-          <w:i w:val="0"/>
-        </w:rPr>
-        <w:t>measurements.csv</w:t>
-      </w:r>
-      <w:r>
-        <w:br/>
+        <w:t xml:space="preserve"> </w:t>
       </w:r>
     </w:p>
     <w:p>
@@ -1974,17 +1971,18 @@
         <w:pStyle w:val="ListBullet"/>
       </w:pPr>
       <w:r>
-        <w:br/>
+        <w:t xml:space="preserve"> </w:t>
       </w:r>
+      <w:hyperlink r:id="rId16">
+        <w:r>
+          <w:rPr>
+            <w:color w:val="245B84"/>
+          </w:rPr>
+          <w:t>powers.csv</w:t>
+        </w:r>
+      </w:hyperlink>
       <w:r>
-        <w:rPr>
-          <w:b w:val="0"/>
-          <w:i w:val="0"/>
-        </w:rPr>
-        <w:t>powers.csv</w:t>
-      </w:r>
-      <w:r>
-        <w:br/>
+        <w:t xml:space="preserve"> </w:t>
       </w:r>
     </w:p>
     <w:p>
@@ -1992,17 +1990,18 @@
         <w:pStyle w:val="ListBullet"/>
       </w:pPr>
       <w:r>
-        <w:br/>
+        <w:t xml:space="preserve"> </w:t>
       </w:r>
+      <w:hyperlink r:id="rId17">
+        <w:r>
+          <w:rPr>
+            <w:color w:val="245B84"/>
+          </w:rPr>
+          <w:t>slopes.csv</w:t>
+        </w:r>
+      </w:hyperlink>
       <w:r>
-        <w:rPr>
-          <w:b w:val="0"/>
-          <w:i w:val="0"/>
-        </w:rPr>
-        <w:t>slopes.csv</w:t>
-      </w:r>
-      <w:r>
-        <w:br/>
+        <w:t xml:space="preserve"> </w:t>
       </w:r>
     </w:p>
     <w:p>
@@ -2010,17 +2009,18 @@
         <w:pStyle w:val="ListBullet"/>
       </w:pPr>
       <w:r>
-        <w:br/>
+        <w:t xml:space="preserve"> </w:t>
       </w:r>
+      <w:hyperlink r:id="rId18">
+        <w:r>
+          <w:rPr>
+            <w:color w:val="245B84"/>
+          </w:rPr>
+          <w:t>Паспорт окружения и контрольные суммы</w:t>
+        </w:r>
+      </w:hyperlink>
       <w:r>
-        <w:rPr>
-          <w:b w:val="0"/>
-          <w:i w:val="0"/>
-        </w:rPr>
-        <w:t>Паспорт окружения и контрольные суммы</w:t>
-      </w:r>
-      <w:r>
-        <w:br/>
+        <w:t xml:space="preserve"> </w:t>
       </w:r>
     </w:p>
     <w:sectPr>
@@ -2479,6 +2479,7 @@
       <w:rFonts w:asciiTheme="majorHAnsi" w:eastAsiaTheme="majorEastAsia" w:hAnsiTheme="majorHAnsi" w:cstheme="majorBidi" w:ascii="Calibri" w:hAnsi="Calibri"/>
       <w:b/>
       <w:bCs/>
+      <w:color w:val="000000"/>
       <w:sz w:val="28"/>
       <w:szCs w:val="28"/>
     </w:rPr>
@@ -2502,6 +2503,7 @@
       <w:rFonts w:asciiTheme="majorHAnsi" w:eastAsiaTheme="majorEastAsia" w:hAnsiTheme="majorHAnsi" w:cstheme="majorBidi" w:ascii="Calibri" w:hAnsi="Calibri"/>
       <w:b/>
       <w:bCs/>
+      <w:color w:val="000000"/>
       <w:sz w:val="26"/>
       <w:szCs w:val="26"/>
     </w:rPr>
@@ -2525,6 +2527,7 @@
       <w:rFonts w:asciiTheme="majorHAnsi" w:eastAsiaTheme="majorEastAsia" w:hAnsiTheme="majorHAnsi" w:cstheme="majorBidi" w:ascii="Calibri" w:hAnsi="Calibri"/>
       <w:b/>
       <w:bCs/>
+      <w:color w:val="000000"/>
     </w:rPr>
   </w:style>
   <w:style w:type="paragraph" w:styleId="Heading4">
@@ -2755,14 +2758,12 @@
     <w:qFormat/>
     <w:rsid w:val="00FC693F"/>
     <w:pPr>
-      <w:pBdr>
-        <w:bottom w:val="single" w:sz="8" w:space="4" w:color="4F81BD" w:themeColor="accent1"/>
-      </w:pBdr>
       <w:spacing w:after="300" w:line="240" w:lineRule="auto"/>
       <w:contextualSpacing/>
     </w:pPr>
     <w:rPr>
       <w:rFonts w:asciiTheme="majorHAnsi" w:eastAsiaTheme="majorEastAsia" w:hAnsiTheme="majorHAnsi" w:cstheme="majorBidi" w:ascii="Calibri" w:hAnsi="Calibri"/>
+      <w:color w:val="000000"/>
       <w:spacing w:val="5"/>
       <w:kern w:val="28"/>
       <w:sz w:val="52"/>
@@ -3241,9 +3242,6 @@
     <w:qFormat/>
     <w:rsid w:val="00FC693F"/>
     <w:pPr>
-      <w:pBdr>
-        <w:bottom w:val="single" w:sz="4" w:space="4" w:color="4F81BD" w:themeColor="accent1"/>
-      </w:pBdr>
       <w:spacing w:before="200" w:after="280"/>
       <w:ind w:left="936" w:right="936"/>
     </w:pPr>

</xml_diff>